<commit_message>
HW 20.1 commit 2
</commit_message>
<xml_diff>
--- a/QA Manual 26.03.2026.docx
+++ b/QA Manual 26.03.2026.docx
@@ -17,6 +17,14 @@
       </w:r>
       <w:r>
         <w:t>QA Manual 26.03.2026</w:t>
+      </w:r>
+    </w:p>
+    <w:p>
+      <w:r>
+        <w:rPr>
+          <w:lang w:val="en-US"/>
+        </w:rPr>
+        <w:t>HW 20.1  commit 2</w:t>
       </w:r>
       <w:r>
         <w:br/>

</xml_diff>